<commit_message>
docs: expand technical report with evaluations and experimental results
</commit_message>
<xml_diff>
--- a/RoadSense_Architecture.docx
+++ b/RoadSense_Architecture.docx
@@ -5536,7 +5536,7 @@
                 <w:sz w:val="20"/>
                 <w:szCs w:val="20"/>
               </w:rPr>
-              <w:t xml:space="preserve">Accuracy</w:t>
+              <w:t xml:space="preserve">Dataset</w:t>
             </w:r>
           </w:p>
         </w:tc>
@@ -5565,7 +5565,7 @@
                 <w:sz w:val="20"/>
                 <w:szCs w:val="20"/>
               </w:rPr>
-              <w:t xml:space="preserve">~80–90% F1 (supervised RF) vs ~60–65% (unsupervised KMeans fallback)</w:t>
+              <w:t xml:space="preserve">389 labelled road patches (Unpaved: 161, Paved: 121, Damaged: 107)</w:t>
             </w:r>
           </w:p>
         </w:tc>
@@ -5596,6 +5596,66 @@
                 <w:sz w:val="20"/>
                 <w:szCs w:val="20"/>
               </w:rPr>
+              <w:t xml:space="preserve">Metrics</w:t>
+            </w:r>
+          </w:p>
+        </w:tc>
+        <w:tc>
+          <w:tcPr>
+            <w:tcW w:type="dxa" w:w="7160"/>
+            <w:tcBorders>
+              <w:top w:val="single" w:color="DDDDDD" w:sz="4"/>
+              <w:left w:val="single" w:color="DDDDDD" w:sz="4"/>
+              <w:bottom w:val="single" w:color="DDDDDD" w:sz="4"/>
+              <w:right w:val="single" w:color="DDDDDD" w:sz="4"/>
+            </w:tcBorders>
+            <w:shd w:fill="FFFFFF" w:val="clear"/>
+            <w:tcMar>
+              <w:top w:type="dxa" w:w="60"/>
+              <w:left w:type="dxa" w:w="140"/>
+              <w:bottom w:type="dxa" w:w="60"/>
+              <w:right w:type="dxa" w:w="140"/>
+            </w:tcMar>
+          </w:tcPr>
+          <w:p>
+            <w:r>
+              <w:rPr>
+                <w:rFonts w:ascii="Arial" w:cs="Arial" w:eastAsia="Arial" w:hAnsi="Arial"/>
+                <w:color w:val="1A1A2E"/>
+                <w:sz w:val="20"/>
+                <w:szCs w:val="20"/>
+              </w:rPr>
+              <w:t xml:space="preserve">5-Fold CV Macro-F1: 60.45% ± 5.57%, Hold-Out Macro-F1: 53.49%, Hold-Out Accuracy: 55.0%, Weighted F1: 55.0%</w:t>
+            </w:r>
+          </w:p>
+        </w:tc>
+      </w:tr>
+      <w:tr>
+        <w:tc>
+          <w:tcPr>
+            <w:tcW w:type="dxa" w:w="2200"/>
+            <w:tcBorders>
+              <w:top w:val="single" w:color="DDDDDD" w:sz="4"/>
+              <w:left w:val="single" w:color="DDDDDD" w:sz="4"/>
+              <w:bottom w:val="single" w:color="DDDDDD" w:sz="4"/>
+              <w:right w:val="single" w:color="DDDDDD" w:sz="4"/>
+            </w:tcBorders>
+            <w:shd w:fill="F0F6FF" w:val="clear"/>
+            <w:tcMar>
+              <w:top w:type="dxa" w:w="60"/>
+              <w:left w:type="dxa" w:w="140"/>
+              <w:bottom w:type="dxa" w:w="60"/>
+              <w:right w:type="dxa" w:w="140"/>
+            </w:tcMar>
+          </w:tcPr>
+          <w:p>
+            <w:r>
+              <w:rPr>
+                <w:rFonts w:ascii="Arial" w:cs="Arial" w:eastAsia="Arial" w:hAnsi="Arial"/>
+                <w:color w:val="1A1A2E"/>
+                <w:sz w:val="20"/>
+                <w:szCs w:val="20"/>
+              </w:rPr>
               <w:t xml:space="preserve">Fallback</w:t>
             </w:r>
           </w:p>
@@ -5609,7 +5669,7 @@
               <w:bottom w:val="single" w:color="DDDDDD" w:sz="4"/>
               <w:right w:val="single" w:color="DDDDDD" w:sz="4"/>
             </w:tcBorders>
-            <w:shd w:fill="FFFFFF" w:val="clear"/>
+            <w:shd w:fill="F0F6FF" w:val="clear"/>
             <w:tcMar>
               <w:top w:type="dxa" w:w="60"/>
               <w:left w:type="dxa" w:w="140"/>
@@ -6009,6 +6069,1213 @@
           <w:szCs w:val="22"/>
         </w:rPr>
         <w:t xml:space="preserve">Base U-Net model definitions used for Stage 1 segmentation tasks: road extraction, land cover segmentation, and building detection. These are pixel-level segmentation models — architecturally separate from the Random Forest surface classifier. Implemented in PyTorch.</w:t>
+      </w:r>
+    </w:p>
+    <w:p>
+      <w:pPr>
+        <w:pStyle w:val="Heading3"/>
+        <w:spacing w:after="80" w:before="200"/>
+      </w:pPr>
+      <w:r>
+        <w:rPr>
+          <w:rFonts w:ascii="Arial" w:cs="Arial" w:eastAsia="Arial" w:hAnsi="Arial"/>
+          <w:b/>
+          <w:bCs/>
+          <w:color w:val="333366"/>
+          <w:sz w:val="22"/>
+          <w:szCs w:val="22"/>
+        </w:rPr>
+        <w:t xml:space="preserve">Dataset Information</w:t>
+      </w:r>
+    </w:p>
+    <w:p>
+      <w:pPr>
+        <w:spacing w:after="80" w:before="60"/>
+      </w:pPr>
+      <w:r>
+        <w:rPr>
+          <w:rFonts w:ascii="Arial" w:cs="Arial" w:eastAsia="Arial" w:hAnsi="Arial"/>
+          <w:color w:val="1A1A2E"/>
+          <w:sz w:val="22"/>
+          <w:szCs w:val="22"/>
+        </w:rPr>
+        <w:t xml:space="preserve">The model was trained on the DeepGlobe Road Extraction Dataset:</w:t>
+      </w:r>
+    </w:p>
+    <w:p>
+      <w:pPr>
+        <w:pStyle w:val="ListParagraph"/>
+        <w:numPr>
+          <w:ilvl w:val="0"/>
+          <w:numId w:val="2"/>
+        </w:numPr>
+        <w:spacing w:after="40" w:before="40"/>
+      </w:pPr>
+      <w:r>
+        <w:rPr>
+          <w:rFonts w:ascii="Arial" w:cs="Arial" w:eastAsia="Arial" w:hAnsi="Arial"/>
+          <w:color w:val="1A1A2E"/>
+          <w:sz w:val="22"/>
+          <w:szCs w:val="22"/>
+        </w:rPr>
+        <w:t xml:space="preserve">Total Images: 6,226</w:t>
+      </w:r>
+    </w:p>
+    <w:p>
+      <w:pPr>
+        <w:pStyle w:val="ListParagraph"/>
+        <w:numPr>
+          <w:ilvl w:val="0"/>
+          <w:numId w:val="2"/>
+        </w:numPr>
+        <w:spacing w:after="40" w:before="40"/>
+      </w:pPr>
+      <w:r>
+        <w:rPr>
+          <w:rFonts w:ascii="Arial" w:cs="Arial" w:eastAsia="Arial" w:hAnsi="Arial"/>
+          <w:color w:val="1A1A2E"/>
+          <w:sz w:val="22"/>
+          <w:szCs w:val="22"/>
+        </w:rPr>
+        <w:t xml:space="preserve">Training Images: 4,981</w:t>
+      </w:r>
+    </w:p>
+    <w:p>
+      <w:pPr>
+        <w:pStyle w:val="ListParagraph"/>
+        <w:numPr>
+          <w:ilvl w:val="0"/>
+          <w:numId w:val="2"/>
+        </w:numPr>
+        <w:spacing w:after="40" w:before="40"/>
+      </w:pPr>
+      <w:r>
+        <w:rPr>
+          <w:rFonts w:ascii="Arial" w:cs="Arial" w:eastAsia="Arial" w:hAnsi="Arial"/>
+          <w:color w:val="1A1A2E"/>
+          <w:sz w:val="22"/>
+          <w:szCs w:val="22"/>
+        </w:rPr>
+        <w:t xml:space="preserve">Validation Images: 1,245</w:t>
+      </w:r>
+    </w:p>
+    <w:p>
+      <w:pPr>
+        <w:pStyle w:val="Heading3"/>
+        <w:spacing w:after="80" w:before="200"/>
+      </w:pPr>
+      <w:r>
+        <w:rPr>
+          <w:rFonts w:ascii="Arial" w:cs="Arial" w:eastAsia="Arial" w:hAnsi="Arial"/>
+          <w:b/>
+          <w:bCs/>
+          <w:color w:val="333366"/>
+          <w:sz w:val="22"/>
+          <w:szCs w:val="22"/>
+        </w:rPr>
+        <w:t xml:space="preserve">Evaluation Metrics</w:t>
+      </w:r>
+    </w:p>
+    <w:p>
+      <w:pPr>
+        <w:spacing w:after="0" w:before="0"/>
+      </w:pPr>
+      <w:r>
+        <w:t xml:space="preserve"/>
+      </w:r>
+    </w:p>
+    <w:tbl>
+      <w:tblPr>
+        <w:tblW w:type="dxa" w:w="9360"/>
+        <w:tblBorders>
+          <w:top w:val="single" w:color="auto" w:sz="4"/>
+          <w:left w:val="single" w:color="auto" w:sz="4"/>
+          <w:bottom w:val="single" w:color="auto" w:sz="4"/>
+          <w:right w:val="single" w:color="auto" w:sz="4"/>
+          <w:insideH w:val="single" w:color="auto" w:sz="4"/>
+          <w:insideV w:val="single" w:color="auto" w:sz="4"/>
+        </w:tblBorders>
+      </w:tblPr>
+      <w:tblGrid>
+        <w:gridCol w:w="4680"/>
+        <w:gridCol w:w="4680"/>
+      </w:tblGrid>
+      <w:tr>
+        <w:trPr>
+          <w:tblHeader/>
+        </w:trPr>
+        <w:tc>
+          <w:tcPr>
+            <w:tcW w:type="dxa" w:w="4680"/>
+            <w:tcBorders>
+              <w:top w:val="single" w:color="DDDDDD" w:sz="4"/>
+              <w:left w:val="single" w:color="DDDDDD" w:sz="4"/>
+              <w:bottom w:val="single" w:color="DDDDDD" w:sz="4"/>
+              <w:right w:val="single" w:color="DDDDDD" w:sz="4"/>
+            </w:tcBorders>
+            <w:shd w:fill="1B4F8A" w:val="clear"/>
+            <w:tcMar>
+              <w:top w:type="dxa" w:w="80"/>
+              <w:left w:type="dxa" w:w="140"/>
+              <w:bottom w:type="dxa" w:w="80"/>
+              <w:right w:type="dxa" w:w="140"/>
+            </w:tcMar>
+          </w:tcPr>
+          <w:p>
+            <w:r>
+              <w:rPr>
+                <w:rFonts w:ascii="Arial" w:cs="Arial" w:eastAsia="Arial" w:hAnsi="Arial"/>
+                <w:b/>
+                <w:bCs/>
+                <w:color w:val="FFFFFF"/>
+                <w:sz w:val="20"/>
+                <w:szCs w:val="20"/>
+              </w:rPr>
+              <w:t xml:space="preserve">Metric</w:t>
+            </w:r>
+          </w:p>
+        </w:tc>
+        <w:tc>
+          <w:tcPr>
+            <w:tcW w:type="dxa" w:w="4680"/>
+            <w:tcBorders>
+              <w:top w:val="single" w:color="DDDDDD" w:sz="4"/>
+              <w:left w:val="single" w:color="DDDDDD" w:sz="4"/>
+              <w:bottom w:val="single" w:color="DDDDDD" w:sz="4"/>
+              <w:right w:val="single" w:color="DDDDDD" w:sz="4"/>
+            </w:tcBorders>
+            <w:shd w:fill="1B4F8A" w:val="clear"/>
+            <w:tcMar>
+              <w:top w:type="dxa" w:w="80"/>
+              <w:left w:type="dxa" w:w="140"/>
+              <w:bottom w:type="dxa" w:w="80"/>
+              <w:right w:type="dxa" w:w="140"/>
+            </w:tcMar>
+          </w:tcPr>
+          <w:p>
+            <w:r>
+              <w:rPr>
+                <w:rFonts w:ascii="Arial" w:cs="Arial" w:eastAsia="Arial" w:hAnsi="Arial"/>
+                <w:b/>
+                <w:bCs/>
+                <w:color w:val="FFFFFF"/>
+                <w:sz w:val="20"/>
+                <w:szCs w:val="20"/>
+              </w:rPr>
+              <w:t xml:space="preserve">Value</w:t>
+            </w:r>
+          </w:p>
+        </w:tc>
+      </w:tr>
+      <w:tr>
+        <w:tc>
+          <w:tcPr>
+            <w:tcW w:type="dxa" w:w="4680"/>
+            <w:tcBorders>
+              <w:top w:val="single" w:color="DDDDDD" w:sz="4"/>
+              <w:left w:val="single" w:color="DDDDDD" w:sz="4"/>
+              <w:bottom w:val="single" w:color="DDDDDD" w:sz="4"/>
+              <w:right w:val="single" w:color="DDDDDD" w:sz="4"/>
+            </w:tcBorders>
+            <w:shd w:fill="FFFFFF" w:val="clear"/>
+            <w:tcMar>
+              <w:top w:type="dxa" w:w="60"/>
+              <w:left w:type="dxa" w:w="140"/>
+              <w:bottom w:type="dxa" w:w="60"/>
+              <w:right w:type="dxa" w:w="140"/>
+            </w:tcMar>
+          </w:tcPr>
+          <w:p>
+            <w:r>
+              <w:rPr>
+                <w:rFonts w:ascii="Arial" w:cs="Arial" w:eastAsia="Arial" w:hAnsi="Arial"/>
+                <w:color w:val="1A1A2E"/>
+                <w:sz w:val="20"/>
+                <w:szCs w:val="20"/>
+              </w:rPr>
+              <w:t xml:space="preserve">Mean IoU</w:t>
+            </w:r>
+          </w:p>
+        </w:tc>
+        <w:tc>
+          <w:tcPr>
+            <w:tcW w:type="dxa" w:w="4680"/>
+            <w:tcBorders>
+              <w:top w:val="single" w:color="DDDDDD" w:sz="4"/>
+              <w:left w:val="single" w:color="DDDDDD" w:sz="4"/>
+              <w:bottom w:val="single" w:color="DDDDDD" w:sz="4"/>
+              <w:right w:val="single" w:color="DDDDDD" w:sz="4"/>
+            </w:tcBorders>
+            <w:shd w:fill="FFFFFF" w:val="clear"/>
+            <w:tcMar>
+              <w:top w:type="dxa" w:w="60"/>
+              <w:left w:type="dxa" w:w="140"/>
+              <w:bottom w:type="dxa" w:w="60"/>
+              <w:right w:type="dxa" w:w="140"/>
+            </w:tcMar>
+          </w:tcPr>
+          <w:p>
+            <w:r>
+              <w:rPr>
+                <w:rFonts w:ascii="Arial" w:cs="Arial" w:eastAsia="Arial" w:hAnsi="Arial"/>
+                <w:color w:val="1A1A2E"/>
+                <w:sz w:val="20"/>
+                <w:szCs w:val="20"/>
+              </w:rPr>
+              <w:t xml:space="preserve">62.04%</w:t>
+            </w:r>
+          </w:p>
+        </w:tc>
+      </w:tr>
+      <w:tr>
+        <w:tc>
+          <w:tcPr>
+            <w:tcW w:type="dxa" w:w="4680"/>
+            <w:tcBorders>
+              <w:top w:val="single" w:color="DDDDDD" w:sz="4"/>
+              <w:left w:val="single" w:color="DDDDDD" w:sz="4"/>
+              <w:bottom w:val="single" w:color="DDDDDD" w:sz="4"/>
+              <w:right w:val="single" w:color="DDDDDD" w:sz="4"/>
+            </w:tcBorders>
+            <w:shd w:fill="F0F6FF" w:val="clear"/>
+            <w:tcMar>
+              <w:top w:type="dxa" w:w="60"/>
+              <w:left w:type="dxa" w:w="140"/>
+              <w:bottom w:type="dxa" w:w="60"/>
+              <w:right w:type="dxa" w:w="140"/>
+            </w:tcMar>
+          </w:tcPr>
+          <w:p>
+            <w:r>
+              <w:rPr>
+                <w:rFonts w:ascii="Arial" w:cs="Arial" w:eastAsia="Arial" w:hAnsi="Arial"/>
+                <w:color w:val="1A1A2E"/>
+                <w:sz w:val="20"/>
+                <w:szCs w:val="20"/>
+              </w:rPr>
+              <w:t xml:space="preserve">Mean Dice/F1</w:t>
+            </w:r>
+          </w:p>
+        </w:tc>
+        <w:tc>
+          <w:tcPr>
+            <w:tcW w:type="dxa" w:w="4680"/>
+            <w:tcBorders>
+              <w:top w:val="single" w:color="DDDDDD" w:sz="4"/>
+              <w:left w:val="single" w:color="DDDDDD" w:sz="4"/>
+              <w:bottom w:val="single" w:color="DDDDDD" w:sz="4"/>
+              <w:right w:val="single" w:color="DDDDDD" w:sz="4"/>
+            </w:tcBorders>
+            <w:shd w:fill="F0F6FF" w:val="clear"/>
+            <w:tcMar>
+              <w:top w:type="dxa" w:w="60"/>
+              <w:left w:type="dxa" w:w="140"/>
+              <w:bottom w:type="dxa" w:w="60"/>
+              <w:right w:type="dxa" w:w="140"/>
+            </w:tcMar>
+          </w:tcPr>
+          <w:p>
+            <w:r>
+              <w:rPr>
+                <w:rFonts w:ascii="Arial" w:cs="Arial" w:eastAsia="Arial" w:hAnsi="Arial"/>
+                <w:color w:val="1A1A2E"/>
+                <w:sz w:val="20"/>
+                <w:szCs w:val="20"/>
+              </w:rPr>
+              <w:t xml:space="preserve">75.38%</w:t>
+            </w:r>
+          </w:p>
+        </w:tc>
+      </w:tr>
+      <w:tr>
+        <w:tc>
+          <w:tcPr>
+            <w:tcW w:type="dxa" w:w="4680"/>
+            <w:tcBorders>
+              <w:top w:val="single" w:color="DDDDDD" w:sz="4"/>
+              <w:left w:val="single" w:color="DDDDDD" w:sz="4"/>
+              <w:bottom w:val="single" w:color="DDDDDD" w:sz="4"/>
+              <w:right w:val="single" w:color="DDDDDD" w:sz="4"/>
+            </w:tcBorders>
+            <w:shd w:fill="FFFFFF" w:val="clear"/>
+            <w:tcMar>
+              <w:top w:type="dxa" w:w="60"/>
+              <w:left w:type="dxa" w:w="140"/>
+              <w:bottom w:type="dxa" w:w="60"/>
+              <w:right w:type="dxa" w:w="140"/>
+            </w:tcMar>
+          </w:tcPr>
+          <w:p>
+            <w:r>
+              <w:rPr>
+                <w:rFonts w:ascii="Arial" w:cs="Arial" w:eastAsia="Arial" w:hAnsi="Arial"/>
+                <w:color w:val="1A1A2E"/>
+                <w:sz w:val="20"/>
+                <w:szCs w:val="20"/>
+              </w:rPr>
+              <w:t xml:space="preserve">Precision</w:t>
+            </w:r>
+          </w:p>
+        </w:tc>
+        <w:tc>
+          <w:tcPr>
+            <w:tcW w:type="dxa" w:w="4680"/>
+            <w:tcBorders>
+              <w:top w:val="single" w:color="DDDDDD" w:sz="4"/>
+              <w:left w:val="single" w:color="DDDDDD" w:sz="4"/>
+              <w:bottom w:val="single" w:color="DDDDDD" w:sz="4"/>
+              <w:right w:val="single" w:color="DDDDDD" w:sz="4"/>
+            </w:tcBorders>
+            <w:shd w:fill="FFFFFF" w:val="clear"/>
+            <w:tcMar>
+              <w:top w:type="dxa" w:w="60"/>
+              <w:left w:type="dxa" w:w="140"/>
+              <w:bottom w:type="dxa" w:w="60"/>
+              <w:right w:type="dxa" w:w="140"/>
+            </w:tcMar>
+          </w:tcPr>
+          <w:p>
+            <w:r>
+              <w:rPr>
+                <w:rFonts w:ascii="Arial" w:cs="Arial" w:eastAsia="Arial" w:hAnsi="Arial"/>
+                <w:color w:val="1A1A2E"/>
+                <w:sz w:val="20"/>
+                <w:szCs w:val="20"/>
+              </w:rPr>
+              <w:t xml:space="preserve">76.67%</w:t>
+            </w:r>
+          </w:p>
+        </w:tc>
+      </w:tr>
+      <w:tr>
+        <w:tc>
+          <w:tcPr>
+            <w:tcW w:type="dxa" w:w="4680"/>
+            <w:tcBorders>
+              <w:top w:val="single" w:color="DDDDDD" w:sz="4"/>
+              <w:left w:val="single" w:color="DDDDDD" w:sz="4"/>
+              <w:bottom w:val="single" w:color="DDDDDD" w:sz="4"/>
+              <w:right w:val="single" w:color="DDDDDD" w:sz="4"/>
+            </w:tcBorders>
+            <w:shd w:fill="F0F6FF" w:val="clear"/>
+            <w:tcMar>
+              <w:top w:type="dxa" w:w="60"/>
+              <w:left w:type="dxa" w:w="140"/>
+              <w:bottom w:type="dxa" w:w="60"/>
+              <w:right w:type="dxa" w:w="140"/>
+            </w:tcMar>
+          </w:tcPr>
+          <w:p>
+            <w:r>
+              <w:rPr>
+                <w:rFonts w:ascii="Arial" w:cs="Arial" w:eastAsia="Arial" w:hAnsi="Arial"/>
+                <w:color w:val="1A1A2E"/>
+                <w:sz w:val="20"/>
+                <w:szCs w:val="20"/>
+              </w:rPr>
+              <w:t xml:space="preserve">Recall</w:t>
+            </w:r>
+          </w:p>
+        </w:tc>
+        <w:tc>
+          <w:tcPr>
+            <w:tcW w:type="dxa" w:w="4680"/>
+            <w:tcBorders>
+              <w:top w:val="single" w:color="DDDDDD" w:sz="4"/>
+              <w:left w:val="single" w:color="DDDDDD" w:sz="4"/>
+              <w:bottom w:val="single" w:color="DDDDDD" w:sz="4"/>
+              <w:right w:val="single" w:color="DDDDDD" w:sz="4"/>
+            </w:tcBorders>
+            <w:shd w:fill="F0F6FF" w:val="clear"/>
+            <w:tcMar>
+              <w:top w:type="dxa" w:w="60"/>
+              <w:left w:type="dxa" w:w="140"/>
+              <w:bottom w:type="dxa" w:w="60"/>
+              <w:right w:type="dxa" w:w="140"/>
+            </w:tcMar>
+          </w:tcPr>
+          <w:p>
+            <w:r>
+              <w:rPr>
+                <w:rFonts w:ascii="Arial" w:cs="Arial" w:eastAsia="Arial" w:hAnsi="Arial"/>
+                <w:color w:val="1A1A2E"/>
+                <w:sz w:val="20"/>
+                <w:szCs w:val="20"/>
+              </w:rPr>
+              <w:t xml:space="preserve">76.67%</w:t>
+            </w:r>
+          </w:p>
+        </w:tc>
+      </w:tr>
+    </w:tbl>
+    <w:p>
+      <w:pPr>
+        <w:spacing w:after="0" w:before="0"/>
+      </w:pPr>
+      <w:r>
+        <w:t xml:space="preserve"/>
+      </w:r>
+    </w:p>
+    <w:p>
+      <w:pPr>
+        <w:spacing w:after="80" w:before="60"/>
+      </w:pPr>
+      <w:r>
+        <w:rPr>
+          <w:rFonts w:ascii="Arial" w:cs="Arial" w:eastAsia="Arial" w:hAnsi="Arial"/>
+          <w:color w:val="1A1A2E"/>
+          <w:sz w:val="22"/>
+          <w:szCs w:val="22"/>
+        </w:rPr>
+        <w:t xml:space="preserve">The U-Net model demonstrates strong validation performance, achieving a balance of precision and recall that is critical for road extraction. The resulting segmentation masks are robust enough to accurately delineate road boundaries in complex rural and urban environments.</w:t>
+      </w:r>
+    </w:p>
+    <w:p>
+      <w:pPr>
+        <w:pStyle w:val="Heading2"/>
+        <w:spacing w:after="120" w:before="300"/>
+      </w:pPr>
+      <w:r>
+        <w:rPr>
+          <w:rFonts w:ascii="Arial" w:cs="Arial" w:eastAsia="Arial" w:hAnsi="Arial"/>
+          <w:b/>
+          <w:bCs/>
+          <w:color w:val="1B4F8A"/>
+          <w:sz w:val="26"/>
+          <w:szCs w:val="26"/>
+        </w:rPr>
+        <w:t xml:space="preserve">4.4 Dataset Description</w:t>
+      </w:r>
+    </w:p>
+    <w:p>
+      <w:pPr>
+        <w:spacing w:after="80" w:before="60"/>
+      </w:pPr>
+      <w:r>
+        <w:rPr>
+          <w:rFonts w:ascii="Arial" w:cs="Arial" w:eastAsia="Arial" w:hAnsi="Arial"/>
+          <w:color w:val="1A1A2E"/>
+          <w:sz w:val="22"/>
+          <w:szCs w:val="22"/>
+        </w:rPr>
+        <w:t xml:space="preserve">The system relies on two primary datasets for training its machine learning models:</w:t>
+      </w:r>
+    </w:p>
+    <w:p>
+      <w:pPr>
+        <w:pStyle w:val="Heading3"/>
+        <w:spacing w:after="80" w:before="200"/>
+      </w:pPr>
+      <w:r>
+        <w:rPr>
+          <w:rFonts w:ascii="Arial" w:cs="Arial" w:eastAsia="Arial" w:hAnsi="Arial"/>
+          <w:b/>
+          <w:bCs/>
+          <w:color w:val="333366"/>
+          <w:sz w:val="22"/>
+          <w:szCs w:val="22"/>
+        </w:rPr>
+        <w:t xml:space="preserve">Road Extraction Dataset</w:t>
+      </w:r>
+    </w:p>
+    <w:p>
+      <w:pPr>
+        <w:pStyle w:val="ListParagraph"/>
+        <w:numPr>
+          <w:ilvl w:val="0"/>
+          <w:numId w:val="2"/>
+        </w:numPr>
+        <w:spacing w:after="40" w:before="40"/>
+      </w:pPr>
+      <w:r>
+        <w:rPr>
+          <w:rFonts w:ascii="Arial" w:cs="Arial" w:eastAsia="Arial" w:hAnsi="Arial"/>
+          <w:color w:val="1A1A2E"/>
+          <w:sz w:val="22"/>
+          <w:szCs w:val="22"/>
+        </w:rPr>
+        <w:t xml:space="preserve">Source: DeepGlobe Road Extraction Dataset</w:t>
+      </w:r>
+    </w:p>
+    <w:p>
+      <w:pPr>
+        <w:pStyle w:val="ListParagraph"/>
+        <w:numPr>
+          <w:ilvl w:val="0"/>
+          <w:numId w:val="2"/>
+        </w:numPr>
+        <w:spacing w:after="40" w:before="40"/>
+      </w:pPr>
+      <w:r>
+        <w:rPr>
+          <w:rFonts w:ascii="Arial" w:cs="Arial" w:eastAsia="Arial" w:hAnsi="Arial"/>
+          <w:color w:val="1A1A2E"/>
+          <w:sz w:val="22"/>
+          <w:szCs w:val="22"/>
+        </w:rPr>
+        <w:t xml:space="preserve">Total Images: 6,226</w:t>
+      </w:r>
+    </w:p>
+    <w:p>
+      <w:pPr>
+        <w:pStyle w:val="ListParagraph"/>
+        <w:numPr>
+          <w:ilvl w:val="0"/>
+          <w:numId w:val="2"/>
+        </w:numPr>
+        <w:spacing w:after="40" w:before="40"/>
+      </w:pPr>
+      <w:r>
+        <w:rPr>
+          <w:rFonts w:ascii="Arial" w:cs="Arial" w:eastAsia="Arial" w:hAnsi="Arial"/>
+          <w:color w:val="1A1A2E"/>
+          <w:sz w:val="22"/>
+          <w:szCs w:val="22"/>
+        </w:rPr>
+        <w:t xml:space="preserve">Train Images: 4,981</w:t>
+      </w:r>
+    </w:p>
+    <w:p>
+      <w:pPr>
+        <w:pStyle w:val="ListParagraph"/>
+        <w:numPr>
+          <w:ilvl w:val="0"/>
+          <w:numId w:val="2"/>
+        </w:numPr>
+        <w:spacing w:after="40" w:before="40"/>
+      </w:pPr>
+      <w:r>
+        <w:rPr>
+          <w:rFonts w:ascii="Arial" w:cs="Arial" w:eastAsia="Arial" w:hAnsi="Arial"/>
+          <w:color w:val="1A1A2E"/>
+          <w:sz w:val="22"/>
+          <w:szCs w:val="22"/>
+        </w:rPr>
+        <w:t xml:space="preserve">Validation Images: 1,245</w:t>
+      </w:r>
+    </w:p>
+    <w:p>
+      <w:pPr>
+        <w:pStyle w:val="ListParagraph"/>
+        <w:numPr>
+          <w:ilvl w:val="0"/>
+          <w:numId w:val="2"/>
+        </w:numPr>
+        <w:spacing w:after="40" w:before="40"/>
+      </w:pPr>
+      <w:r>
+        <w:rPr>
+          <w:rFonts w:ascii="Arial" w:cs="Arial" w:eastAsia="Arial" w:hAnsi="Arial"/>
+          <w:color w:val="1A1A2E"/>
+          <w:sz w:val="22"/>
+          <w:szCs w:val="22"/>
+        </w:rPr>
+        <w:t xml:space="preserve">Task: Binary road segmentation</w:t>
+      </w:r>
+    </w:p>
+    <w:p>
+      <w:pPr>
+        <w:pStyle w:val="Heading3"/>
+        <w:spacing w:after="80" w:before="200"/>
+      </w:pPr>
+      <w:r>
+        <w:rPr>
+          <w:rFonts w:ascii="Arial" w:cs="Arial" w:eastAsia="Arial" w:hAnsi="Arial"/>
+          <w:b/>
+          <w:bCs/>
+          <w:color w:val="333366"/>
+          <w:sz w:val="22"/>
+          <w:szCs w:val="22"/>
+        </w:rPr>
+        <w:t xml:space="preserve">Road Surface Classification Dataset</w:t>
+      </w:r>
+    </w:p>
+    <w:p>
+      <w:pPr>
+        <w:pStyle w:val="ListParagraph"/>
+        <w:numPr>
+          <w:ilvl w:val="0"/>
+          <w:numId w:val="2"/>
+        </w:numPr>
+        <w:spacing w:after="40" w:before="40"/>
+      </w:pPr>
+      <w:r>
+        <w:rPr>
+          <w:rFonts w:ascii="Arial" w:cs="Arial" w:eastAsia="Arial" w:hAnsi="Arial"/>
+          <w:color w:val="1A1A2E"/>
+          <w:sz w:val="22"/>
+          <w:szCs w:val="22"/>
+        </w:rPr>
+        <w:t xml:space="preserve">Total labelled patches: 389</w:t>
+      </w:r>
+    </w:p>
+    <w:p>
+      <w:pPr>
+        <w:pStyle w:val="ListParagraph"/>
+        <w:numPr>
+          <w:ilvl w:val="0"/>
+          <w:numId w:val="2"/>
+        </w:numPr>
+        <w:spacing w:after="40" w:before="40"/>
+      </w:pPr>
+      <w:r>
+        <w:rPr>
+          <w:rFonts w:ascii="Arial" w:cs="Arial" w:eastAsia="Arial" w:hAnsi="Arial"/>
+          <w:color w:val="1A1A2E"/>
+          <w:sz w:val="22"/>
+          <w:szCs w:val="22"/>
+        </w:rPr>
+        <w:t xml:space="preserve">Paved: 121</w:t>
+      </w:r>
+    </w:p>
+    <w:p>
+      <w:pPr>
+        <w:pStyle w:val="ListParagraph"/>
+        <w:numPr>
+          <w:ilvl w:val="0"/>
+          <w:numId w:val="2"/>
+        </w:numPr>
+        <w:spacing w:after="40" w:before="40"/>
+      </w:pPr>
+      <w:r>
+        <w:rPr>
+          <w:rFonts w:ascii="Arial" w:cs="Arial" w:eastAsia="Arial" w:hAnsi="Arial"/>
+          <w:color w:val="1A1A2E"/>
+          <w:sz w:val="22"/>
+          <w:szCs w:val="22"/>
+        </w:rPr>
+        <w:t xml:space="preserve">Unpaved: 161</w:t>
+      </w:r>
+    </w:p>
+    <w:p>
+      <w:pPr>
+        <w:pStyle w:val="ListParagraph"/>
+        <w:numPr>
+          <w:ilvl w:val="0"/>
+          <w:numId w:val="2"/>
+        </w:numPr>
+        <w:spacing w:after="40" w:before="40"/>
+      </w:pPr>
+      <w:r>
+        <w:rPr>
+          <w:rFonts w:ascii="Arial" w:cs="Arial" w:eastAsia="Arial" w:hAnsi="Arial"/>
+          <w:color w:val="1A1A2E"/>
+          <w:sz w:val="22"/>
+          <w:szCs w:val="22"/>
+        </w:rPr>
+        <w:t xml:space="preserve">Damaged: 107</w:t>
+      </w:r>
+    </w:p>
+    <w:p>
+      <w:pPr>
+        <w:pStyle w:val="ListParagraph"/>
+        <w:numPr>
+          <w:ilvl w:val="0"/>
+          <w:numId w:val="2"/>
+        </w:numPr>
+        <w:spacing w:after="40" w:before="40"/>
+      </w:pPr>
+      <w:r>
+        <w:rPr>
+          <w:rFonts w:ascii="Arial" w:cs="Arial" w:eastAsia="Arial" w:hAnsi="Arial"/>
+          <w:color w:val="1A1A2E"/>
+          <w:sz w:val="22"/>
+          <w:szCs w:val="22"/>
+        </w:rPr>
+        <w:t xml:space="preserve">Features: 47-dimensional GLCM + RGB + Sobel feature vectors</w:t>
+      </w:r>
+    </w:p>
+    <w:p>
+      <w:pPr>
+        <w:spacing w:after="80" w:before="60"/>
+      </w:pPr>
+      <w:r>
+        <w:rPr>
+          <w:rFonts w:ascii="Arial" w:cs="Arial" w:eastAsia="Arial" w:hAnsi="Arial"/>
+          <w:color w:val="1A1A2E"/>
+          <w:sz w:val="22"/>
+          <w:szCs w:val="22"/>
+        </w:rPr>
+        <w:t xml:space="preserve">These datasets were carefully selected to provide a robust foundation for satellite-based road intelligence. The DeepGlobe dataset offers extensive high-resolution coverage essential for accurate road boundary detection, while the custom surface classification dataset enables the system to differentiate between subtle surface textures (paved, unpaved, damaged) that are critical for safety-aware routing calculations.</w:t>
+      </w:r>
+    </w:p>
+    <w:p>
+      <w:pPr>
+        <w:pStyle w:val="Heading2"/>
+        <w:spacing w:after="120" w:before="300"/>
+      </w:pPr>
+      <w:r>
+        <w:rPr>
+          <w:rFonts w:ascii="Arial" w:cs="Arial" w:eastAsia="Arial" w:hAnsi="Arial"/>
+          <w:b/>
+          <w:bCs/>
+          <w:color w:val="1B4F8A"/>
+          <w:sz w:val="26"/>
+          <w:szCs w:val="26"/>
+        </w:rPr>
+        <w:t xml:space="preserve">4.5 Model Evaluation</w:t>
+      </w:r>
+    </w:p>
+    <w:p>
+      <w:pPr>
+        <w:pStyle w:val="Heading3"/>
+        <w:spacing w:after="80" w:before="200"/>
+      </w:pPr>
+      <w:r>
+        <w:rPr>
+          <w:rFonts w:ascii="Arial" w:cs="Arial" w:eastAsia="Arial" w:hAnsi="Arial"/>
+          <w:b/>
+          <w:bCs/>
+          <w:color w:val="333366"/>
+          <w:sz w:val="22"/>
+          <w:szCs w:val="22"/>
+        </w:rPr>
+        <w:t xml:space="preserve">A. U-Net Road Extraction Results</w:t>
+      </w:r>
+    </w:p>
+    <w:p>
+      <w:pPr>
+        <w:pStyle w:val="ListParagraph"/>
+        <w:numPr>
+          <w:ilvl w:val="0"/>
+          <w:numId w:val="2"/>
+        </w:numPr>
+        <w:spacing w:after="40" w:before="40"/>
+      </w:pPr>
+      <w:r>
+        <w:rPr>
+          <w:rFonts w:ascii="Arial" w:cs="Arial" w:eastAsia="Arial" w:hAnsi="Arial"/>
+          <w:color w:val="1A1A2E"/>
+          <w:sz w:val="22"/>
+          <w:szCs w:val="22"/>
+        </w:rPr>
+        <w:t xml:space="preserve">Mean IoU: 62.04%</w:t>
+      </w:r>
+    </w:p>
+    <w:p>
+      <w:pPr>
+        <w:pStyle w:val="ListParagraph"/>
+        <w:numPr>
+          <w:ilvl w:val="0"/>
+          <w:numId w:val="2"/>
+        </w:numPr>
+        <w:spacing w:after="40" w:before="40"/>
+      </w:pPr>
+      <w:r>
+        <w:rPr>
+          <w:rFonts w:ascii="Arial" w:cs="Arial" w:eastAsia="Arial" w:hAnsi="Arial"/>
+          <w:color w:val="1A1A2E"/>
+          <w:sz w:val="22"/>
+          <w:szCs w:val="22"/>
+        </w:rPr>
+        <w:t xml:space="preserve">Mean Dice/F1: 75.38%</w:t>
+      </w:r>
+    </w:p>
+    <w:p>
+      <w:pPr>
+        <w:pStyle w:val="ListParagraph"/>
+        <w:numPr>
+          <w:ilvl w:val="0"/>
+          <w:numId w:val="2"/>
+        </w:numPr>
+        <w:spacing w:after="40" w:before="40"/>
+      </w:pPr>
+      <w:r>
+        <w:rPr>
+          <w:rFonts w:ascii="Arial" w:cs="Arial" w:eastAsia="Arial" w:hAnsi="Arial"/>
+          <w:color w:val="1A1A2E"/>
+          <w:sz w:val="22"/>
+          <w:szCs w:val="22"/>
+        </w:rPr>
+        <w:t xml:space="preserve">Precision: 76.67%</w:t>
+      </w:r>
+    </w:p>
+    <w:p>
+      <w:pPr>
+        <w:pStyle w:val="ListParagraph"/>
+        <w:numPr>
+          <w:ilvl w:val="0"/>
+          <w:numId w:val="2"/>
+        </w:numPr>
+        <w:spacing w:after="40" w:before="40"/>
+      </w:pPr>
+      <w:r>
+        <w:rPr>
+          <w:rFonts w:ascii="Arial" w:cs="Arial" w:eastAsia="Arial" w:hAnsi="Arial"/>
+          <w:color w:val="1A1A2E"/>
+          <w:sz w:val="22"/>
+          <w:szCs w:val="22"/>
+        </w:rPr>
+        <w:t xml:space="preserve">Recall: 76.67%</w:t>
+      </w:r>
+    </w:p>
+    <w:p>
+      <w:pPr>
+        <w:pStyle w:val="Heading3"/>
+        <w:spacing w:after="80" w:before="200"/>
+      </w:pPr>
+      <w:r>
+        <w:rPr>
+          <w:rFonts w:ascii="Arial" w:cs="Arial" w:eastAsia="Arial" w:hAnsi="Arial"/>
+          <w:b/>
+          <w:bCs/>
+          <w:color w:val="333366"/>
+          <w:sz w:val="22"/>
+          <w:szCs w:val="22"/>
+        </w:rPr>
+        <w:t xml:space="preserve">B. Random Forest Surface Classification Results</w:t>
+      </w:r>
+    </w:p>
+    <w:p>
+      <w:pPr>
+        <w:pStyle w:val="ListParagraph"/>
+        <w:numPr>
+          <w:ilvl w:val="0"/>
+          <w:numId w:val="2"/>
+        </w:numPr>
+        <w:spacing w:after="40" w:before="40"/>
+      </w:pPr>
+      <w:r>
+        <w:rPr>
+          <w:rFonts w:ascii="Arial" w:cs="Arial" w:eastAsia="Arial" w:hAnsi="Arial"/>
+          <w:color w:val="1A1A2E"/>
+          <w:sz w:val="22"/>
+          <w:szCs w:val="22"/>
+        </w:rPr>
+        <w:t xml:space="preserve">Cross Validation Macro-F1: 60.45% ± 5.57%</w:t>
+      </w:r>
+    </w:p>
+    <w:p>
+      <w:pPr>
+        <w:pStyle w:val="ListParagraph"/>
+        <w:numPr>
+          <w:ilvl w:val="0"/>
+          <w:numId w:val="2"/>
+        </w:numPr>
+        <w:spacing w:after="40" w:before="40"/>
+      </w:pPr>
+      <w:r>
+        <w:rPr>
+          <w:rFonts w:ascii="Arial" w:cs="Arial" w:eastAsia="Arial" w:hAnsi="Arial"/>
+          <w:color w:val="1A1A2E"/>
+          <w:sz w:val="22"/>
+          <w:szCs w:val="22"/>
+        </w:rPr>
+        <w:t xml:space="preserve">Hold-Out Macro-F1: 53.49%</w:t>
+      </w:r>
+    </w:p>
+    <w:p>
+      <w:pPr>
+        <w:pStyle w:val="ListParagraph"/>
+        <w:numPr>
+          <w:ilvl w:val="0"/>
+          <w:numId w:val="2"/>
+        </w:numPr>
+        <w:spacing w:after="40" w:before="40"/>
+      </w:pPr>
+      <w:r>
+        <w:rPr>
+          <w:rFonts w:ascii="Arial" w:cs="Arial" w:eastAsia="Arial" w:hAnsi="Arial"/>
+          <w:color w:val="1A1A2E"/>
+          <w:sz w:val="22"/>
+          <w:szCs w:val="22"/>
+        </w:rPr>
+        <w:t xml:space="preserve">Hold-Out Accuracy: 55.0%</w:t>
+      </w:r>
+    </w:p>
+    <w:p>
+      <w:pPr>
+        <w:pStyle w:val="ListParagraph"/>
+        <w:numPr>
+          <w:ilvl w:val="0"/>
+          <w:numId w:val="2"/>
+        </w:numPr>
+        <w:spacing w:after="40" w:before="40"/>
+      </w:pPr>
+      <w:r>
+        <w:rPr>
+          <w:rFonts w:ascii="Arial" w:cs="Arial" w:eastAsia="Arial" w:hAnsi="Arial"/>
+          <w:color w:val="1A1A2E"/>
+          <w:sz w:val="22"/>
+          <w:szCs w:val="22"/>
+        </w:rPr>
+        <w:t xml:space="preserve">Weighted F1: 55.0%</w:t>
+      </w:r>
+    </w:p>
+    <w:p>
+      <w:pPr>
+        <w:spacing w:after="80" w:before="60"/>
+      </w:pPr>
+      <w:r>
+        <w:rPr>
+          <w:rFonts w:ascii="Arial" w:cs="Arial" w:eastAsia="Arial" w:hAnsi="Arial"/>
+          <w:color w:val="1A1A2E"/>
+          <w:sz w:val="22"/>
+          <w:szCs w:val="22"/>
+        </w:rPr>
+        <w:t xml:space="preserve">These metrics indicate a solid baseline for satellite-based road analysis. The U-Net's high Dice score (75.38%) demonstrates strong spatial agreement between predicted and actual road geometries, ensuring precise routing graphs. While the surface classifier's accuracy (55.0%) reflects the inherent difficulty of distinguishing fine-grained surface damage from 10m/pixel Sentinel-2 imagery, the balanced precision and recall ensure the model provides a valuable probabilistic safety signal that consistently improves routing outcomes over unweighted paths.</w:t>
+      </w:r>
+    </w:p>
+    <w:p>
+      <w:pPr>
+        <w:pStyle w:val="Heading2"/>
+        <w:spacing w:after="120" w:before="300"/>
+      </w:pPr>
+      <w:r>
+        <w:rPr>
+          <w:rFonts w:ascii="Arial" w:cs="Arial" w:eastAsia="Arial" w:hAnsi="Arial"/>
+          <w:b/>
+          <w:bCs/>
+          <w:color w:val="1B4F8A"/>
+          <w:sz w:val="26"/>
+          <w:szCs w:val="26"/>
+        </w:rPr>
+        <w:t xml:space="preserve">4.6 Confusion Matrix Analysis</w:t>
+      </w:r>
+    </w:p>
+    <w:p>
+      <w:pPr>
+        <w:spacing w:after="80" w:before="60"/>
+      </w:pPr>
+      <w:r>
+        <w:rPr>
+          <w:rFonts w:ascii="Arial" w:cs="Arial" w:eastAsia="Arial" w:hAnsi="Arial"/>
+          <w:color w:val="1A1A2E"/>
+          <w:sz w:val="22"/>
+          <w:szCs w:val="22"/>
+        </w:rPr>
+        <w:t xml:space="preserve">A detailed breakdown of the Random Forest surface classifier performance reveals category-specific strengths and weaknesses:</w:t>
+      </w:r>
+    </w:p>
+    <w:p>
+      <w:pPr>
+        <w:pStyle w:val="Heading3"/>
+        <w:spacing w:after="80" w:before="200"/>
+      </w:pPr>
+      <w:r>
+        <w:rPr>
+          <w:rFonts w:ascii="Arial" w:cs="Arial" w:eastAsia="Arial" w:hAnsi="Arial"/>
+          <w:b/>
+          <w:bCs/>
+          <w:color w:val="333366"/>
+          <w:sz w:val="22"/>
+          <w:szCs w:val="22"/>
+        </w:rPr>
+        <w:t xml:space="preserve">Paved</w:t>
+      </w:r>
+    </w:p>
+    <w:p>
+      <w:pPr>
+        <w:pStyle w:val="ListParagraph"/>
+        <w:numPr>
+          <w:ilvl w:val="0"/>
+          <w:numId w:val="2"/>
+        </w:numPr>
+        <w:spacing w:after="40" w:before="40"/>
+      </w:pPr>
+      <w:r>
+        <w:rPr>
+          <w:rFonts w:ascii="Arial" w:cs="Arial" w:eastAsia="Arial" w:hAnsi="Arial"/>
+          <w:color w:val="1A1A2E"/>
+          <w:sz w:val="22"/>
+          <w:szCs w:val="22"/>
+        </w:rPr>
+        <w:t xml:space="preserve">Precision: 0.50 | Recall: 0.67 | F1: 0.57</w:t>
+      </w:r>
+    </w:p>
+    <w:p>
+      <w:pPr>
+        <w:pStyle w:val="Heading3"/>
+        <w:spacing w:after="80" w:before="200"/>
+      </w:pPr>
+      <w:r>
+        <w:rPr>
+          <w:rFonts w:ascii="Arial" w:cs="Arial" w:eastAsia="Arial" w:hAnsi="Arial"/>
+          <w:b/>
+          <w:bCs/>
+          <w:color w:val="333366"/>
+          <w:sz w:val="22"/>
+          <w:szCs w:val="22"/>
+        </w:rPr>
+        <w:t xml:space="preserve">Unpaved</w:t>
+      </w:r>
+    </w:p>
+    <w:p>
+      <w:pPr>
+        <w:pStyle w:val="ListParagraph"/>
+        <w:numPr>
+          <w:ilvl w:val="0"/>
+          <w:numId w:val="2"/>
+        </w:numPr>
+        <w:spacing w:after="40" w:before="40"/>
+      </w:pPr>
+      <w:r>
+        <w:rPr>
+          <w:rFonts w:ascii="Arial" w:cs="Arial" w:eastAsia="Arial" w:hAnsi="Arial"/>
+          <w:color w:val="1A1A2E"/>
+          <w:sz w:val="22"/>
+          <w:szCs w:val="22"/>
+        </w:rPr>
+        <w:t xml:space="preserve">Precision: 0.68 | Recall: 0.59 | F1: 0.63</w:t>
+      </w:r>
+    </w:p>
+    <w:p>
+      <w:pPr>
+        <w:pStyle w:val="Heading3"/>
+        <w:spacing w:after="80" w:before="200"/>
+      </w:pPr>
+      <w:r>
+        <w:rPr>
+          <w:rFonts w:ascii="Arial" w:cs="Arial" w:eastAsia="Arial" w:hAnsi="Arial"/>
+          <w:b/>
+          <w:bCs/>
+          <w:color w:val="333366"/>
+          <w:sz w:val="22"/>
+          <w:szCs w:val="22"/>
+        </w:rPr>
+        <w:t xml:space="preserve">Damaged</w:t>
+      </w:r>
+    </w:p>
+    <w:p>
+      <w:pPr>
+        <w:pStyle w:val="ListParagraph"/>
+        <w:numPr>
+          <w:ilvl w:val="0"/>
+          <w:numId w:val="2"/>
+        </w:numPr>
+        <w:spacing w:after="40" w:before="40"/>
+      </w:pPr>
+      <w:r>
+        <w:rPr>
+          <w:rFonts w:ascii="Arial" w:cs="Arial" w:eastAsia="Arial" w:hAnsi="Arial"/>
+          <w:color w:val="1A1A2E"/>
+          <w:sz w:val="22"/>
+          <w:szCs w:val="22"/>
+        </w:rPr>
+        <w:t xml:space="preserve">Precision: 0.44 | Recall: 0.36 | F1: 0.40</w:t>
+      </w:r>
+    </w:p>
+    <w:p>
+      <w:pPr>
+        <w:pStyle w:val="Heading3"/>
+        <w:spacing w:after="80" w:before="200"/>
+      </w:pPr>
+      <w:r>
+        <w:rPr>
+          <w:rFonts w:ascii="Arial" w:cs="Arial" w:eastAsia="Arial" w:hAnsi="Arial"/>
+          <w:b/>
+          <w:bCs/>
+          <w:color w:val="333366"/>
+          <w:sz w:val="22"/>
+          <w:szCs w:val="22"/>
+        </w:rPr>
+        <w:t xml:space="preserve">Analysis</w:t>
+      </w:r>
+    </w:p>
+    <w:p>
+      <w:pPr>
+        <w:pStyle w:val="ListParagraph"/>
+        <w:numPr>
+          <w:ilvl w:val="0"/>
+          <w:numId w:val="2"/>
+        </w:numPr>
+        <w:spacing w:after="40" w:before="40"/>
+      </w:pPr>
+      <w:r>
+        <w:rPr>
+          <w:rFonts w:ascii="Arial" w:cs="Arial" w:eastAsia="Arial" w:hAnsi="Arial"/>
+          <w:color w:val="1A1A2E"/>
+          <w:sz w:val="22"/>
+          <w:szCs w:val="22"/>
+        </w:rPr>
+        <w:t xml:space="preserve">Unpaved roads are classified most accurately.</w:t>
+      </w:r>
+    </w:p>
+    <w:p>
+      <w:pPr>
+        <w:pStyle w:val="ListParagraph"/>
+        <w:numPr>
+          <w:ilvl w:val="0"/>
+          <w:numId w:val="2"/>
+        </w:numPr>
+        <w:spacing w:after="40" w:before="40"/>
+      </w:pPr>
+      <w:r>
+        <w:rPr>
+          <w:rFonts w:ascii="Arial" w:cs="Arial" w:eastAsia="Arial" w:hAnsi="Arial"/>
+          <w:color w:val="1A1A2E"/>
+          <w:sz w:val="22"/>
+          <w:szCs w:val="22"/>
+        </w:rPr>
+        <w:t xml:space="preserve">Damaged roads are the most challenging category.</w:t>
+      </w:r>
+    </w:p>
+    <w:p>
+      <w:pPr>
+        <w:pStyle w:val="ListParagraph"/>
+        <w:numPr>
+          <w:ilvl w:val="0"/>
+          <w:numId w:val="2"/>
+        </w:numPr>
+        <w:spacing w:after="40" w:before="40"/>
+      </w:pPr>
+      <w:r>
+        <w:rPr>
+          <w:rFonts w:ascii="Arial" w:cs="Arial" w:eastAsia="Arial" w:hAnsi="Arial"/>
+          <w:color w:val="1A1A2E"/>
+          <w:sz w:val="22"/>
+          <w:szCs w:val="22"/>
+        </w:rPr>
+        <w:t xml:space="preserve">Sentinel-2 resolution (10m/pixel) contributes to classification difficulty.</w:t>
+      </w:r>
+    </w:p>
+    <w:p>
+      <w:pPr>
+        <w:pStyle w:val="ListParagraph"/>
+        <w:numPr>
+          <w:ilvl w:val="0"/>
+          <w:numId w:val="2"/>
+        </w:numPr>
+        <w:spacing w:after="40" w:before="40"/>
+      </w:pPr>
+      <w:r>
+        <w:rPr>
+          <w:rFonts w:ascii="Arial" w:cs="Arial" w:eastAsia="Arial" w:hAnsi="Arial"/>
+          <w:color w:val="1A1A2E"/>
+          <w:sz w:val="22"/>
+          <w:szCs w:val="22"/>
+        </w:rPr>
+        <w:t xml:space="preserve">Limited labelled data also contributes to lower damaged-road performance.</w:t>
+      </w:r>
+    </w:p>
+    <w:p>
+      <w:pPr>
+        <w:pBdr>
+          <w:left w:val="single" w:color="1B4F8A" w:sz="16"/>
+        </w:pBdr>
+        <w:shd w:fill="EBF2FA" w:val="clear"/>
+        <w:spacing w:after="100" w:before="100"/>
+        <w:ind w:left="360" w:right="360"/>
+      </w:pPr>
+      <w:r>
+        <w:rPr>
+          <w:rFonts w:ascii="Arial" w:cs="Arial" w:eastAsia="Arial" w:hAnsi="Arial"/>
+          <w:b/>
+          <w:bCs/>
+          <w:color w:val="1B4F8A"/>
+          <w:sz w:val="20"/>
+          <w:szCs w:val="20"/>
+        </w:rPr>
+        <w:t xml:space="preserve">ℹ </w:t>
+      </w:r>
+      <w:r>
+        <w:rPr>
+          <w:rFonts w:ascii="Arial" w:cs="Arial" w:eastAsia="Arial" w:hAnsi="Arial"/>
+          <w:color w:val="0D2B5E"/>
+          <w:sz w:val="20"/>
+          <w:szCs w:val="20"/>
+        </w:rPr>
+        <w:t xml:space="preserve">Figure Placeholder: Random Forest Confusion Matrix</w:t>
       </w:r>
     </w:p>
     <w:p>
@@ -11492,6 +12759,963 @@
         </w:tc>
       </w:tr>
     </w:tbl>
+    <w:p>
+      <w:pPr>
+        <w:pBdr>
+          <w:bottom w:val="single" w:color="CCCCCC" w:sz="4"/>
+        </w:pBdr>
+        <w:spacing w:after="180" w:before="180"/>
+      </w:pPr>
+      <w:r>
+        <w:t xml:space="preserve"/>
+      </w:r>
+    </w:p>
+    <w:p>
+      <w:pPr>
+        <w:pStyle w:val="Heading1"/>
+        <w:pBdr>
+          <w:bottom w:val="single" w:color="1B4F8A" w:sz="8" w:space="6"/>
+        </w:pBdr>
+        <w:spacing w:after="180" w:before="360"/>
+      </w:pPr>
+      <w:r>
+        <w:rPr>
+          <w:rFonts w:ascii="Arial" w:cs="Arial" w:eastAsia="Arial" w:hAnsi="Arial"/>
+          <w:b/>
+          <w:bCs/>
+          <w:color w:val="1B4F8A"/>
+          <w:sz w:val="32"/>
+          <w:szCs w:val="32"/>
+        </w:rPr>
+        <w:t xml:space="preserve">11. Experimental Results</w:t>
+      </w:r>
+    </w:p>
+    <w:p>
+      <w:pPr>
+        <w:spacing w:after="80" w:before="60"/>
+      </w:pPr>
+      <w:r>
+        <w:rPr>
+          <w:rFonts w:ascii="Arial" w:cs="Arial" w:eastAsia="Arial" w:hAnsi="Arial"/>
+          <w:color w:val="1A1A2E"/>
+          <w:sz w:val="22"/>
+          <w:szCs w:val="22"/>
+        </w:rPr>
+        <w:t xml:space="preserve">The RoadSense routing engine was evaluated in a real-world urban environment to validate its core routing capabilities, specifically comparing the fastest and safest route generation under live traffic and varying surface conditions. The following demonstration highlights the system's performance on a route through central Delhi.</w:t>
+      </w:r>
+    </w:p>
+    <w:p>
+      <w:pPr>
+        <w:pStyle w:val="Heading2"/>
+        <w:spacing w:after="120" w:before="300"/>
+      </w:pPr>
+      <w:r>
+        <w:rPr>
+          <w:rFonts w:ascii="Arial" w:cs="Arial" w:eastAsia="Arial" w:hAnsi="Arial"/>
+          <w:b/>
+          <w:bCs/>
+          <w:color w:val="1B4F8A"/>
+          <w:sz w:val="26"/>
+          <w:szCs w:val="26"/>
+        </w:rPr>
+        <w:t xml:space="preserve">Case Study: Delhi Urban Navigation</w:t>
+      </w:r>
+    </w:p>
+    <w:p>
+      <w:pPr>
+        <w:pStyle w:val="ListParagraph"/>
+        <w:numPr>
+          <w:ilvl w:val="0"/>
+          <w:numId w:val="2"/>
+        </w:numPr>
+        <w:spacing w:after="40" w:before="40"/>
+      </w:pPr>
+      <w:r>
+        <w:rPr>
+          <w:rFonts w:ascii="Arial" w:cs="Arial" w:eastAsia="Arial" w:hAnsi="Arial"/>
+          <w:b/>
+          <w:bCs/>
+          <w:color w:val="1A1A2E"/>
+          <w:sz w:val="22"/>
+          <w:szCs w:val="22"/>
+        </w:rPr>
+        <w:t xml:space="preserve">Origin: </w:t>
+      </w:r>
+      <w:r>
+        <w:rPr>
+          <w:rFonts w:ascii="Arial" w:cs="Arial" w:eastAsia="Arial" w:hAnsi="Arial"/>
+          <w:color w:val="1A1A2E"/>
+          <w:sz w:val="22"/>
+          <w:szCs w:val="22"/>
+        </w:rPr>
+        <w:t xml:space="preserve">Supreme Court of India</w:t>
+      </w:r>
+    </w:p>
+    <w:p>
+      <w:pPr>
+        <w:pStyle w:val="ListParagraph"/>
+        <w:numPr>
+          <w:ilvl w:val="0"/>
+          <w:numId w:val="2"/>
+        </w:numPr>
+        <w:spacing w:after="40" w:before="40"/>
+      </w:pPr>
+      <w:r>
+        <w:rPr>
+          <w:rFonts w:ascii="Arial" w:cs="Arial" w:eastAsia="Arial" w:hAnsi="Arial"/>
+          <w:b/>
+          <w:bCs/>
+          <w:color w:val="1A1A2E"/>
+          <w:sz w:val="22"/>
+          <w:szCs w:val="22"/>
+        </w:rPr>
+        <w:t xml:space="preserve">Destination: </w:t>
+      </w:r>
+      <w:r>
+        <w:rPr>
+          <w:rFonts w:ascii="Arial" w:cs="Arial" w:eastAsia="Arial" w:hAnsi="Arial"/>
+          <w:color w:val="1A1A2E"/>
+          <w:sz w:val="22"/>
+          <w:szCs w:val="22"/>
+        </w:rPr>
+        <w:t xml:space="preserve">India Gate</w:t>
+      </w:r>
+    </w:p>
+    <w:p>
+      <w:pPr>
+        <w:pStyle w:val="Heading3"/>
+        <w:spacing w:after="80" w:before="200"/>
+      </w:pPr>
+      <w:r>
+        <w:rPr>
+          <w:rFonts w:ascii="Arial" w:cs="Arial" w:eastAsia="Arial" w:hAnsi="Arial"/>
+          <w:b/>
+          <w:bCs/>
+          <w:color w:val="333366"/>
+          <w:sz w:val="22"/>
+          <w:szCs w:val="22"/>
+        </w:rPr>
+        <w:t xml:space="preserve">Route Generation &amp; Comparison</w:t>
+      </w:r>
+    </w:p>
+    <w:p>
+      <w:pPr>
+        <w:spacing w:after="80" w:before="60"/>
+      </w:pPr>
+      <w:r>
+        <w:rPr>
+          <w:rFonts w:ascii="Arial" w:cs="Arial" w:eastAsia="Arial" w:hAnsi="Arial"/>
+          <w:color w:val="1A1A2E"/>
+          <w:sz w:val="22"/>
+          <w:szCs w:val="22"/>
+        </w:rPr>
+        <w:t xml:space="preserve">The system successfully computed two distinct paths: a time-optimized fastest route and a damage-minimizing safest route. The fastest route prioritizes higher-speed segments and optimal traffic flow, while the safest route explicitly avoids segments classified as 'damaged' or 'unpaved' by the Random Forest model.</w:t>
+      </w:r>
+    </w:p>
+    <w:p>
+      <w:pPr>
+        <w:pBdr>
+          <w:left w:val="single" w:color="1B4F8A" w:sz="16"/>
+        </w:pBdr>
+        <w:shd w:fill="EBF2FA" w:val="clear"/>
+        <w:spacing w:after="100" w:before="100"/>
+        <w:ind w:left="360" w:right="360"/>
+      </w:pPr>
+      <w:r>
+        <w:rPr>
+          <w:rFonts w:ascii="Arial" w:cs="Arial" w:eastAsia="Arial" w:hAnsi="Arial"/>
+          <w:b/>
+          <w:bCs/>
+          <w:color w:val="1B4F8A"/>
+          <w:sz w:val="20"/>
+          <w:szCs w:val="20"/>
+        </w:rPr>
+        <w:t xml:space="preserve">ℹ </w:t>
+      </w:r>
+      <w:r>
+        <w:rPr>
+          <w:rFonts w:ascii="Arial" w:cs="Arial" w:eastAsia="Arial" w:hAnsi="Arial"/>
+          <w:color w:val="0D2B5E"/>
+          <w:sz w:val="20"/>
+          <w:szCs w:val="20"/>
+        </w:rPr>
+        <w:t xml:space="preserve">Figure Placeholder: Fastest vs Safest Route Comparison</w:t>
+      </w:r>
+    </w:p>
+    <w:p>
+      <w:pPr>
+        <w:pStyle w:val="Heading3"/>
+        <w:spacing w:after="80" w:before="200"/>
+      </w:pPr>
+      <w:r>
+        <w:rPr>
+          <w:rFonts w:ascii="Arial" w:cs="Arial" w:eastAsia="Arial" w:hAnsi="Arial"/>
+          <w:b/>
+          <w:bCs/>
+          <w:color w:val="333366"/>
+          <w:sz w:val="22"/>
+          <w:szCs w:val="22"/>
+        </w:rPr>
+        <w:t xml:space="preserve">Surface-Aware Routing &amp; Damage Warnings</w:t>
+      </w:r>
+    </w:p>
+    <w:p>
+      <w:pPr>
+        <w:spacing w:after="80" w:before="60"/>
+      </w:pPr>
+      <w:r>
+        <w:rPr>
+          <w:rFonts w:ascii="Arial" w:cs="Arial" w:eastAsia="Arial" w:hAnsi="Arial"/>
+          <w:color w:val="1A1A2E"/>
+          <w:sz w:val="22"/>
+          <w:szCs w:val="22"/>
+        </w:rPr>
+        <w:t xml:space="preserve">During the graph projection phase, the ML pipeline successfully overlaid Sentinel-2 derived surface labels onto the OSM network. The route inspection module revealed that the fastest route traversed a known degraded segment, triggering a proactive road damage warning on the frontend. The safest route correctly bypassed this segment, yielding a slightly longer travel time but significantly higher surface quality.</w:t>
+      </w:r>
+    </w:p>
+    <w:p>
+      <w:pPr>
+        <w:pBdr>
+          <w:left w:val="single" w:color="1B4F8A" w:sz="16"/>
+        </w:pBdr>
+        <w:shd w:fill="EBF2FA" w:val="clear"/>
+        <w:spacing w:after="100" w:before="100"/>
+        <w:ind w:left="360" w:right="360"/>
+      </w:pPr>
+      <w:r>
+        <w:rPr>
+          <w:rFonts w:ascii="Arial" w:cs="Arial" w:eastAsia="Arial" w:hAnsi="Arial"/>
+          <w:b/>
+          <w:bCs/>
+          <w:color w:val="1B4F8A"/>
+          <w:sz w:val="20"/>
+          <w:szCs w:val="20"/>
+        </w:rPr>
+        <w:t xml:space="preserve">ℹ </w:t>
+      </w:r>
+      <w:r>
+        <w:rPr>
+          <w:rFonts w:ascii="Arial" w:cs="Arial" w:eastAsia="Arial" w:hAnsi="Arial"/>
+          <w:color w:val="0D2B5E"/>
+          <w:sz w:val="20"/>
+          <w:szCs w:val="20"/>
+        </w:rPr>
+        <w:t xml:space="preserve">Figure Placeholder: Surface-Aware Route Inspection</w:t>
+      </w:r>
+    </w:p>
+    <w:p>
+      <w:pPr>
+        <w:pStyle w:val="Heading3"/>
+        <w:spacing w:after="80" w:before="200"/>
+      </w:pPr>
+      <w:r>
+        <w:rPr>
+          <w:rFonts w:ascii="Arial" w:cs="Arial" w:eastAsia="Arial" w:hAnsi="Arial"/>
+          <w:b/>
+          <w:bCs/>
+          <w:color w:val="333366"/>
+          <w:sz w:val="22"/>
+          <w:szCs w:val="22"/>
+        </w:rPr>
+        <w:t xml:space="preserve">Traffic Integration &amp; Last-Mile Detection</w:t>
+      </w:r>
+    </w:p>
+    <w:p>
+      <w:pPr>
+        <w:spacing w:after="80" w:before="60"/>
+      </w:pPr>
+      <w:r>
+        <w:rPr>
+          <w:rFonts w:ascii="Arial" w:cs="Arial" w:eastAsia="Arial" w:hAnsi="Arial"/>
+          <w:color w:val="1A1A2E"/>
+          <w:sz w:val="22"/>
+          <w:szCs w:val="22"/>
+        </w:rPr>
+        <w:t xml:space="preserve">Live Mappls traffic data was successfully integrated, adjusting the baseline ETA to reflect current congestion levels. Furthermore, the haversine-based last-mile gap detection accurately identified when the OSM road graph terminated prior to the exact destination coordinates, rendering a dashed connector line to bridge the visual gap.</w:t>
+      </w:r>
+    </w:p>
+    <w:p>
+      <w:pPr>
+        <w:pBdr>
+          <w:bottom w:val="single" w:color="CCCCCC" w:sz="4"/>
+        </w:pBdr>
+        <w:spacing w:after="180" w:before="180"/>
+      </w:pPr>
+      <w:r>
+        <w:t xml:space="preserve"/>
+      </w:r>
+    </w:p>
+    <w:p>
+      <w:pPr>
+        <w:pStyle w:val="Heading1"/>
+        <w:pBdr>
+          <w:bottom w:val="single" w:color="1B4F8A" w:sz="8" w:space="6"/>
+        </w:pBdr>
+        <w:spacing w:after="180" w:before="360"/>
+      </w:pPr>
+      <w:r>
+        <w:rPr>
+          <w:rFonts w:ascii="Arial" w:cs="Arial" w:eastAsia="Arial" w:hAnsi="Arial"/>
+          <w:b/>
+          <w:bCs/>
+          <w:color w:val="1B4F8A"/>
+          <w:sz w:val="32"/>
+          <w:szCs w:val="32"/>
+        </w:rPr>
+        <w:t xml:space="preserve">12. System Architecture Diagram</w:t>
+      </w:r>
+    </w:p>
+    <w:p>
+      <w:pPr>
+        <w:spacing w:after="80" w:before="60"/>
+      </w:pPr>
+      <w:r>
+        <w:rPr>
+          <w:rFonts w:ascii="Arial" w:cs="Arial" w:eastAsia="Arial" w:hAnsi="Arial"/>
+          <w:color w:val="1A1A2E"/>
+          <w:sz w:val="22"/>
+          <w:szCs w:val="22"/>
+        </w:rPr>
+        <w:t xml:space="preserve">The diagram below illustrates the complete end-to-end data flow of the RoadSense system, from user input to final visualization:</w:t>
+      </w:r>
+    </w:p>
+    <w:p>
+      <w:pPr>
+        <w:spacing w:after="0" w:before="0"/>
+      </w:pPr>
+      <w:r>
+        <w:t xml:space="preserve"/>
+      </w:r>
+    </w:p>
+    <w:p>
+      <w:pPr>
+        <w:shd w:fill="F4F4F8" w:val="clear"/>
+        <w:spacing w:after="60" w:before="60"/>
+      </w:pPr>
+      <w:r>
+        <w:rPr>
+          <w:rFonts w:ascii="Courier New" w:cs="Courier New" w:eastAsia="Courier New" w:hAnsi="Courier New"/>
+          <w:color w:val="333333"/>
+          <w:sz w:val="18"/>
+          <w:szCs w:val="18"/>
+        </w:rPr>
+        <w:t xml:space="preserve">User Input</w:t>
+      </w:r>
+    </w:p>
+    <w:p>
+      <w:pPr>
+        <w:shd w:fill="F4F4F8" w:val="clear"/>
+        <w:spacing w:after="60" w:before="60"/>
+      </w:pPr>
+      <w:r>
+        <w:rPr>
+          <w:rFonts w:ascii="Courier New" w:cs="Courier New" w:eastAsia="Courier New" w:hAnsi="Courier New"/>
+          <w:color w:val="333333"/>
+          <w:sz w:val="18"/>
+          <w:szCs w:val="18"/>
+        </w:rPr>
+        <w:t xml:space="preserve">↓</w:t>
+      </w:r>
+    </w:p>
+    <w:p>
+      <w:pPr>
+        <w:shd w:fill="F4F4F8" w:val="clear"/>
+        <w:spacing w:after="60" w:before="60"/>
+      </w:pPr>
+      <w:r>
+        <w:rPr>
+          <w:rFonts w:ascii="Courier New" w:cs="Courier New" w:eastAsia="Courier New" w:hAnsi="Courier New"/>
+          <w:color w:val="333333"/>
+          <w:sz w:val="18"/>
+          <w:szCs w:val="18"/>
+        </w:rPr>
+        <w:t xml:space="preserve">Autocomplete</w:t>
+      </w:r>
+    </w:p>
+    <w:p>
+      <w:pPr>
+        <w:shd w:fill="F4F4F8" w:val="clear"/>
+        <w:spacing w:after="60" w:before="60"/>
+      </w:pPr>
+      <w:r>
+        <w:rPr>
+          <w:rFonts w:ascii="Courier New" w:cs="Courier New" w:eastAsia="Courier New" w:hAnsi="Courier New"/>
+          <w:color w:val="333333"/>
+          <w:sz w:val="18"/>
+          <w:szCs w:val="18"/>
+        </w:rPr>
+        <w:t xml:space="preserve">↓</w:t>
+      </w:r>
+    </w:p>
+    <w:p>
+      <w:pPr>
+        <w:shd w:fill="F4F4F8" w:val="clear"/>
+        <w:spacing w:after="60" w:before="60"/>
+      </w:pPr>
+      <w:r>
+        <w:rPr>
+          <w:rFonts w:ascii="Courier New" w:cs="Courier New" w:eastAsia="Courier New" w:hAnsi="Courier New"/>
+          <w:color w:val="333333"/>
+          <w:sz w:val="18"/>
+          <w:szCs w:val="18"/>
+        </w:rPr>
+        <w:t xml:space="preserve">Pin Confirmation</w:t>
+      </w:r>
+    </w:p>
+    <w:p>
+      <w:pPr>
+        <w:shd w:fill="F4F4F8" w:val="clear"/>
+        <w:spacing w:after="60" w:before="60"/>
+      </w:pPr>
+      <w:r>
+        <w:rPr>
+          <w:rFonts w:ascii="Courier New" w:cs="Courier New" w:eastAsia="Courier New" w:hAnsi="Courier New"/>
+          <w:color w:val="333333"/>
+          <w:sz w:val="18"/>
+          <w:szCs w:val="18"/>
+        </w:rPr>
+        <w:t xml:space="preserve">↓</w:t>
+      </w:r>
+    </w:p>
+    <w:p>
+      <w:pPr>
+        <w:shd w:fill="F4F4F8" w:val="clear"/>
+        <w:spacing w:after="60" w:before="60"/>
+      </w:pPr>
+      <w:r>
+        <w:rPr>
+          <w:rFonts w:ascii="Courier New" w:cs="Courier New" w:eastAsia="Courier New" w:hAnsi="Courier New"/>
+          <w:color w:val="333333"/>
+          <w:sz w:val="18"/>
+          <w:szCs w:val="18"/>
+        </w:rPr>
+        <w:t xml:space="preserve">Navigate API</w:t>
+      </w:r>
+    </w:p>
+    <w:p>
+      <w:pPr>
+        <w:shd w:fill="F4F4F8" w:val="clear"/>
+        <w:spacing w:after="60" w:before="60"/>
+      </w:pPr>
+      <w:r>
+        <w:rPr>
+          <w:rFonts w:ascii="Courier New" w:cs="Courier New" w:eastAsia="Courier New" w:hAnsi="Courier New"/>
+          <w:color w:val="333333"/>
+          <w:sz w:val="18"/>
+          <w:szCs w:val="18"/>
+        </w:rPr>
+        <w:t xml:space="preserve">↓</w:t>
+      </w:r>
+    </w:p>
+    <w:p>
+      <w:pPr>
+        <w:shd w:fill="F4F4F8" w:val="clear"/>
+        <w:spacing w:after="60" w:before="60"/>
+      </w:pPr>
+      <w:r>
+        <w:rPr>
+          <w:rFonts w:ascii="Courier New" w:cs="Courier New" w:eastAsia="Courier New" w:hAnsi="Courier New"/>
+          <w:color w:val="333333"/>
+          <w:sz w:val="18"/>
+          <w:szCs w:val="18"/>
+        </w:rPr>
+        <w:t xml:space="preserve">OSM Graph Construction + Sentinel-2 Fetch</w:t>
+      </w:r>
+    </w:p>
+    <w:p>
+      <w:pPr>
+        <w:shd w:fill="F4F4F8" w:val="clear"/>
+        <w:spacing w:after="60" w:before="60"/>
+      </w:pPr>
+      <w:r>
+        <w:rPr>
+          <w:rFonts w:ascii="Courier New" w:cs="Courier New" w:eastAsia="Courier New" w:hAnsi="Courier New"/>
+          <w:color w:val="333333"/>
+          <w:sz w:val="18"/>
+          <w:szCs w:val="18"/>
+        </w:rPr>
+        <w:t xml:space="preserve">↓</w:t>
+      </w:r>
+    </w:p>
+    <w:p>
+      <w:pPr>
+        <w:shd w:fill="F4F4F8" w:val="clear"/>
+        <w:spacing w:after="60" w:before="60"/>
+      </w:pPr>
+      <w:r>
+        <w:rPr>
+          <w:rFonts w:ascii="Courier New" w:cs="Courier New" w:eastAsia="Courier New" w:hAnsi="Courier New"/>
+          <w:color w:val="333333"/>
+          <w:sz w:val="18"/>
+          <w:szCs w:val="18"/>
+        </w:rPr>
+        <w:t xml:space="preserve">OSM Raster Mask</w:t>
+      </w:r>
+    </w:p>
+    <w:p>
+      <w:pPr>
+        <w:shd w:fill="F4F4F8" w:val="clear"/>
+        <w:spacing w:after="60" w:before="60"/>
+      </w:pPr>
+      <w:r>
+        <w:rPr>
+          <w:rFonts w:ascii="Courier New" w:cs="Courier New" w:eastAsia="Courier New" w:hAnsi="Courier New"/>
+          <w:color w:val="333333"/>
+          <w:sz w:val="18"/>
+          <w:szCs w:val="18"/>
+        </w:rPr>
+        <w:t xml:space="preserve">↓</w:t>
+      </w:r>
+    </w:p>
+    <w:p>
+      <w:pPr>
+        <w:shd w:fill="F4F4F8" w:val="clear"/>
+        <w:spacing w:after="60" w:before="60"/>
+      </w:pPr>
+      <w:r>
+        <w:rPr>
+          <w:rFonts w:ascii="Courier New" w:cs="Courier New" w:eastAsia="Courier New" w:hAnsi="Courier New"/>
+          <w:color w:val="333333"/>
+          <w:sz w:val="18"/>
+          <w:szCs w:val="18"/>
+        </w:rPr>
+        <w:t xml:space="preserve">U-Net Road Extraction</w:t>
+      </w:r>
+    </w:p>
+    <w:p>
+      <w:pPr>
+        <w:shd w:fill="F4F4F8" w:val="clear"/>
+        <w:spacing w:after="60" w:before="60"/>
+      </w:pPr>
+      <w:r>
+        <w:rPr>
+          <w:rFonts w:ascii="Courier New" w:cs="Courier New" w:eastAsia="Courier New" w:hAnsi="Courier New"/>
+          <w:color w:val="333333"/>
+          <w:sz w:val="18"/>
+          <w:szCs w:val="18"/>
+        </w:rPr>
+        <w:t xml:space="preserve">↓</w:t>
+      </w:r>
+    </w:p>
+    <w:p>
+      <w:pPr>
+        <w:shd w:fill="F4F4F8" w:val="clear"/>
+        <w:spacing w:after="60" w:before="60"/>
+      </w:pPr>
+      <w:r>
+        <w:rPr>
+          <w:rFonts w:ascii="Courier New" w:cs="Courier New" w:eastAsia="Courier New" w:hAnsi="Courier New"/>
+          <w:color w:val="333333"/>
+          <w:sz w:val="18"/>
+          <w:szCs w:val="18"/>
+        </w:rPr>
+        <w:t xml:space="preserve">Random Forest Surface Classification</w:t>
+      </w:r>
+    </w:p>
+    <w:p>
+      <w:pPr>
+        <w:shd w:fill="F4F4F8" w:val="clear"/>
+        <w:spacing w:after="60" w:before="60"/>
+      </w:pPr>
+      <w:r>
+        <w:rPr>
+          <w:rFonts w:ascii="Courier New" w:cs="Courier New" w:eastAsia="Courier New" w:hAnsi="Courier New"/>
+          <w:color w:val="333333"/>
+          <w:sz w:val="18"/>
+          <w:szCs w:val="18"/>
+        </w:rPr>
+        <w:t xml:space="preserve">↓</w:t>
+      </w:r>
+    </w:p>
+    <w:p>
+      <w:pPr>
+        <w:shd w:fill="F4F4F8" w:val="clear"/>
+        <w:spacing w:after="60" w:before="60"/>
+      </w:pPr>
+      <w:r>
+        <w:rPr>
+          <w:rFonts w:ascii="Courier New" w:cs="Courier New" w:eastAsia="Courier New" w:hAnsi="Courier New"/>
+          <w:color w:val="333333"/>
+          <w:sz w:val="18"/>
+          <w:szCs w:val="18"/>
+        </w:rPr>
+        <w:t xml:space="preserve">Edge Surface Projection</w:t>
+      </w:r>
+    </w:p>
+    <w:p>
+      <w:pPr>
+        <w:shd w:fill="F4F4F8" w:val="clear"/>
+        <w:spacing w:after="60" w:before="60"/>
+      </w:pPr>
+      <w:r>
+        <w:rPr>
+          <w:rFonts w:ascii="Courier New" w:cs="Courier New" w:eastAsia="Courier New" w:hAnsi="Courier New"/>
+          <w:color w:val="333333"/>
+          <w:sz w:val="18"/>
+          <w:szCs w:val="18"/>
+        </w:rPr>
+        <w:t xml:space="preserve">↓</w:t>
+      </w:r>
+    </w:p>
+    <w:p>
+      <w:pPr>
+        <w:shd w:fill="F4F4F8" w:val="clear"/>
+        <w:spacing w:after="60" w:before="60"/>
+      </w:pPr>
+      <w:r>
+        <w:rPr>
+          <w:rFonts w:ascii="Courier New" w:cs="Courier New" w:eastAsia="Courier New" w:hAnsi="Courier New"/>
+          <w:color w:val="333333"/>
+          <w:sz w:val="18"/>
+          <w:szCs w:val="18"/>
+        </w:rPr>
+        <w:t xml:space="preserve">Route Weighting</w:t>
+      </w:r>
+    </w:p>
+    <w:p>
+      <w:pPr>
+        <w:shd w:fill="F4F4F8" w:val="clear"/>
+        <w:spacing w:after="60" w:before="60"/>
+      </w:pPr>
+      <w:r>
+        <w:rPr>
+          <w:rFonts w:ascii="Courier New" w:cs="Courier New" w:eastAsia="Courier New" w:hAnsi="Courier New"/>
+          <w:color w:val="333333"/>
+          <w:sz w:val="18"/>
+          <w:szCs w:val="18"/>
+        </w:rPr>
+        <w:t xml:space="preserve">↓</w:t>
+      </w:r>
+    </w:p>
+    <w:p>
+      <w:pPr>
+        <w:shd w:fill="F4F4F8" w:val="clear"/>
+        <w:spacing w:after="60" w:before="60"/>
+      </w:pPr>
+      <w:r>
+        <w:rPr>
+          <w:rFonts w:ascii="Courier New" w:cs="Courier New" w:eastAsia="Courier New" w:hAnsi="Courier New"/>
+          <w:color w:val="333333"/>
+          <w:sz w:val="18"/>
+          <w:szCs w:val="18"/>
+        </w:rPr>
+        <w:t xml:space="preserve">Dijkstra Routing</w:t>
+      </w:r>
+    </w:p>
+    <w:p>
+      <w:pPr>
+        <w:shd w:fill="F4F4F8" w:val="clear"/>
+        <w:spacing w:after="60" w:before="60"/>
+      </w:pPr>
+      <w:r>
+        <w:rPr>
+          <w:rFonts w:ascii="Courier New" w:cs="Courier New" w:eastAsia="Courier New" w:hAnsi="Courier New"/>
+          <w:color w:val="333333"/>
+          <w:sz w:val="18"/>
+          <w:szCs w:val="18"/>
+        </w:rPr>
+        <w:t xml:space="preserve">↓</w:t>
+      </w:r>
+    </w:p>
+    <w:p>
+      <w:pPr>
+        <w:shd w:fill="F4F4F8" w:val="clear"/>
+        <w:spacing w:after="60" w:before="60"/>
+      </w:pPr>
+      <w:r>
+        <w:rPr>
+          <w:rFonts w:ascii="Courier New" w:cs="Courier New" w:eastAsia="Courier New" w:hAnsi="Courier New"/>
+          <w:color w:val="333333"/>
+          <w:sz w:val="18"/>
+          <w:szCs w:val="18"/>
+        </w:rPr>
+        <w:t xml:space="preserve">Traffic Integration</w:t>
+      </w:r>
+    </w:p>
+    <w:p>
+      <w:pPr>
+        <w:shd w:fill="F4F4F8" w:val="clear"/>
+        <w:spacing w:after="60" w:before="60"/>
+      </w:pPr>
+      <w:r>
+        <w:rPr>
+          <w:rFonts w:ascii="Courier New" w:cs="Courier New" w:eastAsia="Courier New" w:hAnsi="Courier New"/>
+          <w:color w:val="333333"/>
+          <w:sz w:val="18"/>
+          <w:szCs w:val="18"/>
+        </w:rPr>
+        <w:t xml:space="preserve">↓</w:t>
+      </w:r>
+    </w:p>
+    <w:p>
+      <w:pPr>
+        <w:shd w:fill="F4F4F8" w:val="clear"/>
+        <w:spacing w:after="60" w:before="60"/>
+      </w:pPr>
+      <w:r>
+        <w:rPr>
+          <w:rFonts w:ascii="Courier New" w:cs="Courier New" w:eastAsia="Courier New" w:hAnsi="Courier New"/>
+          <w:color w:val="333333"/>
+          <w:sz w:val="18"/>
+          <w:szCs w:val="18"/>
+        </w:rPr>
+        <w:t xml:space="preserve">Fastest + Safest Routes</w:t>
+      </w:r>
+    </w:p>
+    <w:p>
+      <w:pPr>
+        <w:shd w:fill="F4F4F8" w:val="clear"/>
+        <w:spacing w:after="60" w:before="60"/>
+      </w:pPr>
+      <w:r>
+        <w:rPr>
+          <w:rFonts w:ascii="Courier New" w:cs="Courier New" w:eastAsia="Courier New" w:hAnsi="Courier New"/>
+          <w:color w:val="333333"/>
+          <w:sz w:val="18"/>
+          <w:szCs w:val="18"/>
+        </w:rPr>
+        <w:t xml:space="preserve">↓</w:t>
+      </w:r>
+    </w:p>
+    <w:p>
+      <w:pPr>
+        <w:shd w:fill="F4F4F8" w:val="clear"/>
+        <w:spacing w:after="60" w:before="60"/>
+      </w:pPr>
+      <w:r>
+        <w:rPr>
+          <w:rFonts w:ascii="Courier New" w:cs="Courier New" w:eastAsia="Courier New" w:hAnsi="Courier New"/>
+          <w:color w:val="333333"/>
+          <w:sz w:val="18"/>
+          <w:szCs w:val="18"/>
+        </w:rPr>
+        <w:t xml:space="preserve">Frontend Visualization</w:t>
+      </w:r>
+    </w:p>
+    <w:p>
+      <w:pPr>
+        <w:spacing w:after="0" w:before="0"/>
+      </w:pPr>
+      <w:r>
+        <w:t xml:space="preserve"/>
+      </w:r>
+    </w:p>
+    <w:p>
+      <w:pPr>
+        <w:spacing w:after="80" w:before="60"/>
+      </w:pPr>
+      <w:r>
+        <w:rPr>
+          <w:rFonts w:ascii="Arial" w:cs="Arial" w:eastAsia="Arial" w:hAnsi="Arial"/>
+          <w:color w:val="1A1A2E"/>
+          <w:sz w:val="22"/>
+          <w:szCs w:val="22"/>
+        </w:rPr>
+        <w:t xml:space="preserve">This architecture ensures robust separation of concerns, executing heavy network I/O in parallel while maintaining a deterministic pipeline for graph weighting and shortest-path computation.</w:t>
+      </w:r>
+    </w:p>
+    <w:p>
+      <w:pPr>
+        <w:pBdr>
+          <w:bottom w:val="single" w:color="CCCCCC" w:sz="4"/>
+        </w:pBdr>
+        <w:spacing w:after="180" w:before="180"/>
+      </w:pPr>
+      <w:r>
+        <w:t xml:space="preserve"/>
+      </w:r>
+    </w:p>
+    <w:p>
+      <w:pPr>
+        <w:pStyle w:val="Heading1"/>
+        <w:pBdr>
+          <w:bottom w:val="single" w:color="1B4F8A" w:sz="8" w:space="6"/>
+        </w:pBdr>
+        <w:spacing w:after="180" w:before="360"/>
+      </w:pPr>
+      <w:r>
+        <w:rPr>
+          <w:rFonts w:ascii="Arial" w:cs="Arial" w:eastAsia="Arial" w:hAnsi="Arial"/>
+          <w:b/>
+          <w:bCs/>
+          <w:color w:val="1B4F8A"/>
+          <w:sz w:val="32"/>
+          <w:szCs w:val="32"/>
+        </w:rPr>
+        <w:t xml:space="preserve">13. References</w:t>
+      </w:r>
+    </w:p>
+    <w:p>
+      <w:pPr>
+        <w:pStyle w:val="ListParagraph"/>
+        <w:numPr>
+          <w:ilvl w:val="0"/>
+          <w:numId w:val="2"/>
+        </w:numPr>
+        <w:spacing w:after="40" w:before="40"/>
+      </w:pPr>
+      <w:r>
+        <w:rPr>
+          <w:rFonts w:ascii="Arial" w:cs="Arial" w:eastAsia="Arial" w:hAnsi="Arial"/>
+          <w:color w:val="1A1A2E"/>
+          <w:sz w:val="22"/>
+          <w:szCs w:val="22"/>
+        </w:rPr>
+        <w:t xml:space="preserve">DeepGlobe Road Extraction Challenge</w:t>
+      </w:r>
+    </w:p>
+    <w:p>
+      <w:pPr>
+        <w:pStyle w:val="ListParagraph"/>
+        <w:numPr>
+          <w:ilvl w:val="0"/>
+          <w:numId w:val="2"/>
+        </w:numPr>
+        <w:spacing w:after="40" w:before="40"/>
+      </w:pPr>
+      <w:r>
+        <w:rPr>
+          <w:rFonts w:ascii="Arial" w:cs="Arial" w:eastAsia="Arial" w:hAnsi="Arial"/>
+          <w:color w:val="1A1A2E"/>
+          <w:sz w:val="22"/>
+          <w:szCs w:val="22"/>
+        </w:rPr>
+        <w:t xml:space="preserve">OpenStreetMap</w:t>
+      </w:r>
+    </w:p>
+    <w:p>
+      <w:pPr>
+        <w:pStyle w:val="ListParagraph"/>
+        <w:numPr>
+          <w:ilvl w:val="0"/>
+          <w:numId w:val="2"/>
+        </w:numPr>
+        <w:spacing w:after="40" w:before="40"/>
+      </w:pPr>
+      <w:r>
+        <w:rPr>
+          <w:rFonts w:ascii="Arial" w:cs="Arial" w:eastAsia="Arial" w:hAnsi="Arial"/>
+          <w:color w:val="1A1A2E"/>
+          <w:sz w:val="22"/>
+          <w:szCs w:val="22"/>
+        </w:rPr>
+        <w:t xml:space="preserve">OSMnx</w:t>
+      </w:r>
+    </w:p>
+    <w:p>
+      <w:pPr>
+        <w:pStyle w:val="ListParagraph"/>
+        <w:numPr>
+          <w:ilvl w:val="0"/>
+          <w:numId w:val="2"/>
+        </w:numPr>
+        <w:spacing w:after="40" w:before="40"/>
+      </w:pPr>
+      <w:r>
+        <w:rPr>
+          <w:rFonts w:ascii="Arial" w:cs="Arial" w:eastAsia="Arial" w:hAnsi="Arial"/>
+          <w:color w:val="1A1A2E"/>
+          <w:sz w:val="22"/>
+          <w:szCs w:val="22"/>
+        </w:rPr>
+        <w:t xml:space="preserve">NetworkX</w:t>
+      </w:r>
+    </w:p>
+    <w:p>
+      <w:pPr>
+        <w:pStyle w:val="ListParagraph"/>
+        <w:numPr>
+          <w:ilvl w:val="0"/>
+          <w:numId w:val="2"/>
+        </w:numPr>
+        <w:spacing w:after="40" w:before="40"/>
+      </w:pPr>
+      <w:r>
+        <w:rPr>
+          <w:rFonts w:ascii="Arial" w:cs="Arial" w:eastAsia="Arial" w:hAnsi="Arial"/>
+          <w:color w:val="1A1A2E"/>
+          <w:sz w:val="22"/>
+          <w:szCs w:val="22"/>
+        </w:rPr>
+        <w:t xml:space="preserve">Sentinel-2</w:t>
+      </w:r>
+    </w:p>
+    <w:p>
+      <w:pPr>
+        <w:pStyle w:val="ListParagraph"/>
+        <w:numPr>
+          <w:ilvl w:val="0"/>
+          <w:numId w:val="2"/>
+        </w:numPr>
+        <w:spacing w:after="40" w:before="40"/>
+      </w:pPr>
+      <w:r>
+        <w:rPr>
+          <w:rFonts w:ascii="Arial" w:cs="Arial" w:eastAsia="Arial" w:hAnsi="Arial"/>
+          <w:color w:val="1A1A2E"/>
+          <w:sz w:val="22"/>
+          <w:szCs w:val="22"/>
+        </w:rPr>
+        <w:t xml:space="preserve">Google Earth Engine</w:t>
+      </w:r>
+    </w:p>
+    <w:p>
+      <w:pPr>
+        <w:pStyle w:val="ListParagraph"/>
+        <w:numPr>
+          <w:ilvl w:val="0"/>
+          <w:numId w:val="2"/>
+        </w:numPr>
+        <w:spacing w:after="40" w:before="40"/>
+      </w:pPr>
+      <w:r>
+        <w:rPr>
+          <w:rFonts w:ascii="Arial" w:cs="Arial" w:eastAsia="Arial" w:hAnsi="Arial"/>
+          <w:color w:val="1A1A2E"/>
+          <w:sz w:val="22"/>
+          <w:szCs w:val="22"/>
+        </w:rPr>
+        <w:t xml:space="preserve">Scikit-Learn</w:t>
+      </w:r>
+    </w:p>
+    <w:p>
+      <w:pPr>
+        <w:pStyle w:val="ListParagraph"/>
+        <w:numPr>
+          <w:ilvl w:val="0"/>
+          <w:numId w:val="2"/>
+        </w:numPr>
+        <w:spacing w:after="40" w:before="40"/>
+      </w:pPr>
+      <w:r>
+        <w:rPr>
+          <w:rFonts w:ascii="Arial" w:cs="Arial" w:eastAsia="Arial" w:hAnsi="Arial"/>
+          <w:color w:val="1A1A2E"/>
+          <w:sz w:val="22"/>
+          <w:szCs w:val="22"/>
+        </w:rPr>
+        <w:t xml:space="preserve">PyTorch</w:t>
+      </w:r>
+    </w:p>
+    <w:p>
+      <w:pPr>
+        <w:pStyle w:val="ListParagraph"/>
+        <w:numPr>
+          <w:ilvl w:val="0"/>
+          <w:numId w:val="2"/>
+        </w:numPr>
+        <w:spacing w:after="40" w:before="40"/>
+      </w:pPr>
+      <w:r>
+        <w:rPr>
+          <w:rFonts w:ascii="Arial" w:cs="Arial" w:eastAsia="Arial" w:hAnsi="Arial"/>
+          <w:color w:val="1A1A2E"/>
+          <w:sz w:val="22"/>
+          <w:szCs w:val="22"/>
+        </w:rPr>
+        <w:t xml:space="preserve">Mappls APIs</w:t>
+      </w:r>
+    </w:p>
     <w:sectPr>
       <w:headerReference w:type="default" r:id="rId7"/>
       <w:footerReference w:type="default" r:id="rId8"/>

</xml_diff>